<commit_message>
merged in changes from proofreader
</commit_message>
<xml_diff>
--- a/public/docs/is-2026.docx
+++ b/public/docs/is-2026.docx
@@ -49,6 +49,65 @@
       </w:r>
     </w:p>
     <w:p>
+      <w:pPr/>
+      <w:r>
+        <w:rPr/>
+        <w:t xml:space="preserve">The 2016 presidential election brought a great deal of attention to immigration and immigrants in American society. Much of that debate perpetuated harmful stereotypes, dangerously stoked fears about outsiders, and echoed a nativist rhetoric that many believed had become irrelevant to public discourse. The debate also ignored how current discussions are deeply rooted in centuries-long conversations about who is allowed into the country and what it means to be an American.</w:t>
+      </w:r>
+    </w:p>
+    <w:p>
+      <w:pPr/>
+      <w:r>
+        <w:rPr/>
+        <w:t xml:space="preserve">In response to that election, a team of immigration historians from the Immigration History Research Center at the University of Minnesota and the Immigration and Ethnic History Society created the first #ImmigrationSyllabus. Its goal was to provide historical context to current debates over immigration reform, integration, and citizenship. The original #ImmigrationSyllabus provided an important resource for teachers, students, scholars, journalists, organizers, and communities seeking to understand the centrality of immigrants and immigration to our nation’s past.</w:t>
+      </w:r>
+    </w:p>
+    <w:p>
+      <w:pPr/>
+      <w:r>
+        <w:rPr/>
+        <w:t xml:space="preserve">In 2025, as the United States was embroiled in a surge of increased xenophobia and immigration enforcement, the Immigration History Research Center embarked on an update to this important resource guide. We convened a new team of scholars, consulted with the original authors of the syllabus, and created this revised and updated #ImmigrationSyllabus. This update is by no means intended to replace the original; we encourage you to view the original </w:t>
+      </w:r>
+      <w:r>
+        <w:rPr/>
+        <w:t xml:space="preserve">#ImmigrationSyllabus</w:t>
+      </w:r>
+      <w:r>
+        <w:rPr/>
+        <w:t xml:space="preserve"> here. Our goal was to incorporate new scholarship and resources that have emerged since the original’s publication and to highlight works in United States migration history that speak to the exigencies of the current moment.</w:t>
+      </w:r>
+    </w:p>
+    <w:p>
+      <w:pPr/>
+      <w:r>
+        <w:rPr/>
+        <w:t xml:space="preserve">The revised and updated #ImmigrationSyllabus follows a loosely chronological overview of US immigration history, but with thematic emphases on issues like deportation and detention that transcend time periods. As there are many ways of learning immigration history, the topics included here are not intended to be exhaustive. Rather, we have selected readings that directly offer historical context for understanding contemporary immigration politics and have proven useful in our teaching.Each week of the syllabus provides a selection of relevant scholarship, as well as a list of resources that may be useful in a classroom or workshop setting. We prioritized recent scholarship to give a sense of how the field of immigration history is developing, but please see the original </w:t>
+      </w:r>
+      <w:r>
+        <w:rPr/>
+        <w:t xml:space="preserve">#ImmigrationSyllabus</w:t>
+      </w:r>
+      <w:r>
+        <w:rPr/>
+        <w:t xml:space="preserve"> for additional important works.</w:t>
+      </w:r>
+    </w:p>
+    <w:p>
+      <w:pPr/>
+      <w:r>
+        <w:rPr/>
+        <w:t xml:space="preserve">As with the original, we hope that this updated resource guide will help educators and activists in their teaching, advocacy, and public discussions about immigration in the United States historically and today. We also hope that it will assist policymakers who seek to avoid the mistakes of the past. We encourage you to reach out to the Immigration History Research Center at </w:t>
+      </w:r>
+      <w:r>
+        <w:rPr/>
+        <w:t xml:space="preserve">IHRC@umn.edu</w:t>
+      </w:r>
+      <w:r>
+        <w:rPr/>
+        <w:t xml:space="preserve"> with any questions.</w:t>
+      </w:r>
+    </w:p>
+    <w:p>
       <w:pPr>
         <w:pBdr>
           <w:bottom w:val="single" w:sz="6" w:space="1" w:color="auto"/>
@@ -57,65 +116,6 @@
       </w:pPr>
     </w:p>
     <w:p>
-      <w:pPr/>
-      <w:r>
-        <w:rPr/>
-        <w:t xml:space="preserve">The 2016 presidential election brought a great deal of attention to immigration and immigrants in American society. Much of that debate perpetuated harmful stereotypes, dangerously stoked fears about outsiders, and echoed a nativist rhetoric that many believed had become irrelevant to public discourse. The debate also ignored how current discussions are deeply rooted in centuries-long conversations about who is allowed into the country and what it means to be an American.</w:t>
-      </w:r>
-    </w:p>
-    <w:p>
-      <w:pPr/>
-      <w:r>
-        <w:rPr/>
-        <w:t xml:space="preserve">In response to that election, a team of immigration historians from the Immigration History Research Center at the University of Minnesota and the Immigration and Ethnic History Society created the first #ImmigrationSyllabus. Its goal was to provide historical context to current debates over immigration reform, integration, and citizenship. The original #ImmigrationSyllabus provided an important resource for teachers, students, scholars, journalists, organizers, and communities seeking to understand the centrality of immigrants and immigration to our nation’s past.</w:t>
-      </w:r>
-    </w:p>
-    <w:p>
-      <w:pPr/>
-      <w:r>
-        <w:rPr/>
-        <w:t xml:space="preserve">In 2025, as the United States was embroiled in a surge of increased xenophobia and immigration enforcement, the Immigration History Research Center embarked on an update to this important resource guide. We convened a new team of scholars, consulted with the original authors of the syllabus, and created this revised and updated #ImmigrationSyllabus. This update is by no means intended to replace the original; we encourage you to view the original </w:t>
-      </w:r>
-      <w:r>
-        <w:rPr/>
-        <w:t xml:space="preserve">#ImmigrationSyllabus</w:t>
-      </w:r>
-      <w:r>
-        <w:rPr/>
-        <w:t xml:space="preserve"> here. Our goal was to incorporate new scholarship and resources that have emerged since the original’s publication and to highlight works in United States migration history that speak to the exigencies of the current moment.</w:t>
-      </w:r>
-    </w:p>
-    <w:p>
-      <w:pPr/>
-      <w:r>
-        <w:rPr/>
-        <w:t xml:space="preserve">The revised and updated #ImmigrationSyllabus follows a loosely chronological overview of US immigration history, but with thematic emphases on issues like deportation and detention that transcend time periods. As there are many ways of learning immigration history, the topics included here are not intended to be exhaustive. Rather, we have selected readings that directly offer historical context for understanding contemporary immigration politics and have proven useful in our teaching.Each week of the syllabus provides a selection of relevant scholarship, as well as a list of resources that may be useful in a classroom or workshop setting. We prioritized recent scholarship to give a sense of how the field of immigration history is developing, but please see the original </w:t>
-      </w:r>
-      <w:r>
-        <w:rPr/>
-        <w:t xml:space="preserve">#ImmigrationSyllabus</w:t>
-      </w:r>
-      <w:r>
-        <w:rPr/>
-        <w:t xml:space="preserve"> for additional important works.</w:t>
-      </w:r>
-    </w:p>
-    <w:p>
-      <w:pPr/>
-      <w:r>
-        <w:rPr/>
-        <w:t xml:space="preserve">As with the original, we hope that this updated resource guide will help educators and activists in their teaching, advocacy, and public discussions about immigration in the United States historically and today. We also hope that it will assist policymakers who seek to avoid the mistakes of the past. We encourage you to reach out to the Immigration History Research Center at </w:t>
-      </w:r>
-      <w:r>
-        <w:rPr/>
-        <w:t xml:space="preserve">IHRC@umn.edu</w:t>
-      </w:r>
-      <w:r>
-        <w:rPr/>
-        <w:t xml:space="preserve"> with any questions.</w:t>
-      </w:r>
-    </w:p>
-    <w:p>
       <w:pPr>
         <w:pStyle w:val="Heading2"/>
         <w:keepNext/>
@@ -129,7 +129,7 @@
       <w:pPr/>
       <w:r>
         <w:rPr/>
-        <w:t xml:space="preserve">The United States is home to the world’s largest population of foreign-born people—more than 50 million immigrants, comprising over 15% of the total number of Americans. The nation’s immigration history is a 500-year tale of human decision making, economic development, social transformation, political conflict, and globalization; it is also a story of dispossession, discrimination, xenophobia, and mass deportations.Making sense of immigration history means studying its key aspects and how these aspects changed over time: why people migrated and how they understood their journeys; whom they displaced or exploited; what kinds of labor they performed and whether they prospered; how they were scrutinized, restricted, or welcomed by those already here; which traditions they maintained, abandoned, or adapted; and ultimately how they shaped the long arc of the national history. This section offers broad overviews and theoretical underpinnings for studying US immigration history.</w:t>
+        <w:t xml:space="preserve">The United States is home to the world’s largest population of foreign-born people—more than 50 million immigrants, comprising over 15% of the total number of Americans. The nation’s immigration history is a 500-year tale of human decision-making, economic development, social transformation, political conflict, and globalization; it is also a story of dispossession, discrimination, xenophobia, and mass deportations. Making sense of immigration history means studying its key aspects and how these aspects changed over time; why people migrated and how they understood their journeys; whom they displaced or exploited; what kinds of labor they performed and whether they prospered; how they were scrutinized, restricted, or welcomed by those already here; which traditions they maintained, abandoned, or adapted; and ultimately how they shaped the long arc of the national history. This section offers broad overviews and theoretical underpinnings for studying US immigration history.</w:t>
       </w:r>
     </w:p>
     <w:p>
@@ -179,7 +179,7 @@
       </w:pPr>
       <w:r>
         <w:rPr/>
-        <w:t xml:space="preserve">Alexander T. Aleinikoff and Alexandra Délano, ed. </w:t>
+        <w:t xml:space="preserve">T. Alexander Aleinikoff and Alexandra Délano. </w:t>
       </w:r>
       <w:r>
         <w:rPr>
@@ -314,7 +314,7 @@
       </w:r>
       <w:r>
         <w:rPr/>
-        <w:t xml:space="preserve"> 84, no. 2 (September 1997): 524-558</w:t>
+        <w:t xml:space="preserve"> 84, no. 2 (September 1997): 524–558</w:t>
       </w:r>
     </w:p>
     <w:p>
@@ -329,7 +329,7 @@
       </w:pPr>
       <w:r>
         <w:rPr/>
-        <w:t xml:space="preserve">Adam Goodman, "Nation of Migrants, Historians of Migration," </w:t>
+        <w:t xml:space="preserve">Adam Goodman, "Nation of migrants, historians of migration," </w:t>
       </w:r>
       <w:r>
         <w:rPr>
@@ -339,7 +339,7 @@
       </w:r>
       <w:r>
         <w:rPr/>
-        <w:t xml:space="preserve"> 34, no. 4 (Summer 2015): 7-16</w:t>
+        <w:t xml:space="preserve"> 34, no. 4 (Summer 2015): 7–16</w:t>
       </w:r>
     </w:p>
     <w:p>
@@ -414,7 +414,7 @@
       </w:r>
       <w:r>
         <w:rPr/>
-        <w:t xml:space="preserve"> 56, no.1 (Spring 2025):1-19</w:t>
+        <w:t xml:space="preserve"> 56, no.1 (Spring 2025) : 1–19</w:t>
       </w:r>
     </w:p>
     <w:p>
@@ -464,7 +464,7 @@
       </w:r>
       <w:r>
         <w:rPr/>
-        <w:t xml:space="preserve">, ed. Eric Foner and Lisa McGirr (2011), 358-375</w:t>
+        <w:t xml:space="preserve">, eds. Eric Foner and Lisa McGirr (2011), 358–375</w:t>
       </w:r>
     </w:p>
     <w:p>
@@ -539,7 +539,7 @@
       </w:r>
       <w:r>
         <w:rPr/>
-        <w:t xml:space="preserve"> (2017)</w:t>
+        <w:t xml:space="preserve"> (2016)</w:t>
       </w:r>
     </w:p>
     <w:p>
@@ -623,7 +623,7 @@
             <w:color w:val="0000FF" w:themeColor="hyperlink"/>
             <w:u w:val="single"/>
           </w:rPr>
-          <w:t xml:space="preserve">Diary of John Harrower (indentured servant), 1773-1776</w:t>
+          <w:t xml:space="preserve">Diary of John Harrower (indentured servant), 1773–1776</w:t>
         </w:r>
       </w:hyperlink>
       <w:r>
@@ -700,7 +700,7 @@
       </w:hyperlink>
       <w:r>
         <w:rPr/>
-        <w:t xml:space="preserve">, The Schomburg Center for Research in Black Culture (digital history project)</w:t>
+        <w:t xml:space="preserve">, Schomburg Center for Research in Black Culture (digital history project)</w:t>
       </w:r>
     </w:p>
     <w:p>
@@ -728,7 +728,7 @@
       </w:hyperlink>
       <w:r>
         <w:rPr/>
-        <w:t xml:space="preserve">,” Public Radio International, July 4, 2016 (public-facing article)</w:t>
+        <w:t xml:space="preserve">,” The World, July 4, 2016 (public-facing article)</w:t>
       </w:r>
     </w:p>
     <w:p>
@@ -800,7 +800,7 @@
       </w:hyperlink>
       <w:r>
         <w:rPr/>
-        <w:t xml:space="preserve">, Center for Immigration Law and Policy at the UCLA School of Law and Million Dollar Hoods (digital history)</w:t>
+        <w:t xml:space="preserve">, Miñana Family Center for Immigration Law and Policy at the UCLA School of Law and Million Dollar Hoods (digital history)</w:t>
       </w:r>
     </w:p>
     <w:p>
@@ -906,6 +906,14 @@
         <w:rPr/>
         <w:t xml:space="preserve">, Center for Global Migration Studies and Immigration and Ethnic History Society (podcast series)</w:t>
       </w:r>
+    </w:p>
+    <w:p>
+      <w:pPr>
+        <w:pBdr>
+          <w:bottom w:val="single" w:sz="6" w:space="1" w:color="auto"/>
+        </w:pBdr>
+        <w:spacing w:before="0" w:after="0" w:line="1" w:lineRule="auto"/>
+      </w:pPr>
     </w:p>
     <w:p>
       <w:pPr>
@@ -921,7 +929,7 @@
       <w:pPr/>
       <w:r>
         <w:rPr/>
-        <w:t xml:space="preserve">From the colonial period through the nineteenth century, North America received immigrants from multiple parts of the world. Europeans remained the numerical majority, but immigrants also came from Asia and Latin America, contributing to the racial, ethnic, cultural, and religious diversity of American society. The growing diversity of people in the United States led to questions of who should be considered US citizens and members in American society. These questions were complicated by the United States’ territorial expansion, which was accompanied by the dispossession of Native Americans and the incorporation of Mexicans into the American polity as a conquered population. The debate over slavery also shaped the ways white Americans viewed Chinese immigrants, who were considered comparable to slaves as unfree “coolie” workers. The status and perception of immigrants in the United States were deeply intertwined with territorial expansion, settler colonialism, and slavery, and these histories are thus essential to understanding US immigration history.</w:t>
+        <w:t xml:space="preserve">From the colonial period through the nineteenth century, North America received immigrants from multiple parts of the world. Europeans remained the numerical majority, but immigrants also came from Asia and Latin America, contributing to the racial, ethnic, cultural, and religious diversity of American society. The growing diversity of people in the United States led to questions of who should be considered US citizens and members of American society. These questions were complicated by the United States’ territorial expansion, which was accompanied by the dispossession of Native Americans and the incorporation of Mexicans into the American polity as a conquered population. The debate over slavery also shaped the ways white Americans viewed Chinese immigrants, who were considered comparable to slaves as unfree “coolie” workers. The status and perception of immigrants in the United States were deeply intertwined with territorial expansion, settler colonialism, and slavery, and these histories are thus essential to understanding US immigration history.</w:t>
       </w:r>
     </w:p>
     <w:p>
@@ -952,7 +960,7 @@
         <w:rPr>
           <w:i/>
         </w:rPr>
-        <w:t xml:space="preserve">The Barbarous Years: The Peopling of British North America: The Conflict of Civilizations, 1600-1675</w:t>
+        <w:t xml:space="preserve">The Barbarous Years: The Peopling of British North America: The Conflict of Civilizations, 1600–1675</w:t>
       </w:r>
       <w:r>
         <w:rPr/>
@@ -1427,7 +1435,7 @@
         <w:rPr>
           <w:i/>
         </w:rPr>
-        <w:t xml:space="preserve">Freedom Bound: Law, Labor, and Civic Identity in Colonizing English America, 1580-1865</w:t>
+        <w:t xml:space="preserve">Freedom Bound: Law, Labor, and Civic Identity in Colonizing English America, 1580–1865</w:t>
       </w:r>
       <w:r>
         <w:rPr/>
@@ -1527,33 +1535,32 @@
           <w:numId w:val="4"/>
         </w:numPr>
       </w:pPr>
+      <w:r>
+        <w:rPr/>
+        <w:t xml:space="preserve">Olaudah Equiano, [</w:t>
+      </w:r>
+      <w:r>
+        <w:rPr>
+          <w:i/>
+        </w:rPr>
+        <w:t xml:space="preserve">Olaudah Equiano, The Interesting Narrative of the Life of Olaudah Equiano, or Gustavus Vassa, the African</w:t>
+      </w:r>
+      <w:r>
+        <w:rPr/>
+        <w:t xml:space="preserve">], 1789(</w:t>
+      </w:r>
       <w:hyperlink w:history="1" r:id="rId26">
         <w:r>
           <w:rPr>
             <w:color w:val="0000FF" w:themeColor="hyperlink"/>
             <w:u w:val="single"/>
           </w:rPr>
-          <w:t xml:space="preserve">Olaudah Equiano, </w:t>
-        </w:r>
-        <w:r>
-          <w:rPr>
-            <w:color w:val="0000FF" w:themeColor="hyperlink"/>
-            <w:u w:val="single"/>
-            <w:i/>
-          </w:rPr>
-          <w:t xml:space="preserve">The Interesting Narrative and Other Writings,</w:t>
-        </w:r>
-        <w:r>
-          <w:rPr>
-            <w:color w:val="0000FF" w:themeColor="hyperlink"/>
-            <w:u w:val="single"/>
-          </w:rPr>
-          <w:t xml:space="preserve"> 1789</w:t>
-        </w:r>
-      </w:hyperlink>
-      <w:r>
-        <w:rPr/>
-        <w:t xml:space="preserve">, Project Gutenberg (primary source)</w:t>
+          <w:t xml:space="preserve">https://www.gutenberg.org/files/15399/15399-h/15399-h.htm</w:t>
+        </w:r>
+      </w:hyperlink>
+      <w:r>
+        <w:rPr/>
+        <w:t xml:space="preserve">), Project Gutenberg (primary source)</w:t>
       </w:r>
     </w:p>
     <w:p>
@@ -1577,7 +1584,7 @@
       </w:hyperlink>
       <w:r>
         <w:rPr/>
-        <w:t xml:space="preserve">, Emory University (database)</w:t>
+        <w:t xml:space="preserve">, Emory University. (database)</w:t>
       </w:r>
     </w:p>
     <w:p>
@@ -1744,7 +1751,7 @@
             <w:color w:val="0000FF" w:themeColor="hyperlink"/>
             <w:u w:val="single"/>
           </w:rPr>
-          <w:t xml:space="preserve">Immigration Challenges for New Americans</w:t>
+          <w:t xml:space="preserve">Immigration: Challenges for New Americans</w:t>
         </w:r>
       </w:hyperlink>
       <w:r>
@@ -1816,12 +1823,12 @@
             <w:color w:val="0000FF" w:themeColor="hyperlink"/>
             <w:u w:val="single"/>
           </w:rPr>
-          <w:t xml:space="preserve">Texas Runaway Slave Project,</w:t>
-        </w:r>
-      </w:hyperlink>
-      <w:r>
-        <w:rPr/>
-        <w:t xml:space="preserve"> East Texas Digital Archive (database)</w:t>
+          <w:t xml:space="preserve">Texas Runaway Slave Project</w:t>
+        </w:r>
+      </w:hyperlink>
+      <w:r>
+        <w:rPr/>
+        <w:t xml:space="preserve">, East Texas Digital Archive (database)</w:t>
       </w:r>
     </w:p>
     <w:p>
@@ -2049,6 +2056,16 @@
         <w:rPr/>
         <w:t xml:space="preserve">, Oklahoma State University (database)</w:t>
       </w:r>
+    </w:p>
+    <w:p>
+      <w:pPr>
+        <w:pStyle w:val="ListParagraph"/>
+        <w:numPr>
+          <w:ilvl w:val="0"/>
+          <w:numId w:val="0"/>
+        </w:numPr>
+        <w:ind w:left="720"/>
+      </w:pPr>
     </w:p>
     <w:p>
       <w:pPr>
@@ -2064,7 +2081,7 @@
       <w:pPr/>
       <w:r>
         <w:rPr/>
-        <w:t xml:space="preserve">The arrival of immigrants in growing numbers during the nineteenth century was met with a rising tide of nativism, as previous generations of settlers reimagined themselves as native to the United States and thereby entitled to distinct privileges. Hostility to immigrants was expressed in diverse forms, including anti-foreigner political movements, anti-Catholicism, private violence, and claims that particular groups of immigrants were forever “alien” and would never assimilate into American society. Nativist sentiments in this period triggered the introduction of state and federal laws to restrict the immigration of Black people, the poor, and Chinese laborers. These laws were driven by the ideas that undesirable, inferior foreigners were threatening Americans and that the United States had the right to protect itself from foreign threats. While nativism persists, this section focuses on nativist movements and laws introduced in the nineteenth century, which laid many of the ideological and legal foundations for modern U.S. immigration policy.</w:t>
+        <w:t xml:space="preserve">The arrival of immigrants in growing numbers during the nineteenth century was met with a rising tide of nativism, as previous generations of settlers reimagined themselves as native to the United States and thereby entitled to distinct privileges. Hostility to immigrants was expressed in diverse forms, including anti-foreigner political movements, anti-Catholicism, private violence, and claims that particular groups of immigrants were forever “alien” and would never assimilate into American society. Nativist sentiments in this period triggered the introduction of state and federal laws to restrict the immigration of Black people, the poor, and Chinese laborers. These laws were driven by the ideas that undesirable, inferior foreigners were threatening Americans and that the United States had the right to protect itself from foreign threats. While nativism persists, this section focuses on nativist movements and laws introduced in the nineteenth century, which laid many of the ideological and legal foundations for modern US immigration policy.</w:t>
       </w:r>
     </w:p>
     <w:p>
@@ -2270,11 +2287,11 @@
         <w:rPr>
           <w:i/>
         </w:rPr>
-        <w:t xml:space="preserve">The Fires of Philadelphia: Citizen-Soldiers, Nativists, and the 1844 Riots over the Soul of a Nation</w:t>
-      </w:r>
-      <w:r>
-        <w:rPr/>
-        <w:t xml:space="preserve"> (2021)</w:t>
+        <w:t xml:space="preserve">The Fires of Philadelphia: Citizen-Soldiers, Nativists, and the 1844 Riots Over the Soul of a Nation</w:t>
+      </w:r>
+      <w:r>
+        <w:rPr/>
+        <w:t xml:space="preserve"> (2020)</w:t>
       </w:r>
     </w:p>
     <w:p>
@@ -2299,7 +2316,7 @@
       </w:r>
       <w:r>
         <w:rPr/>
-        <w:t xml:space="preserve"> 11, no.3 (September 2021): 317-339</w:t>
+        <w:t xml:space="preserve"> 11, no.3 (September 2021): 317–339</w:t>
       </w:r>
     </w:p>
     <w:p>
@@ -2414,7 +2431,7 @@
             <w:color w:val="0000FF" w:themeColor="hyperlink"/>
             <w:u w:val="single"/>
           </w:rPr>
-          <w:t xml:space="preserve">Asiatic Exclusion League, “Proceedings,” 1908</w:t>
+          <w:t xml:space="preserve">Proceedings of the Asiatic Exclusion League</w:t>
         </w:r>
       </w:hyperlink>
       <w:r>
@@ -2475,21 +2492,155 @@
           <w:rPr>
             <w:color w:val="0000FF" w:themeColor="hyperlink"/>
             <w:u w:val="single"/>
+          </w:rPr>
+          <w:t xml:space="preserve">Chae Chan Ping v. U.S. (Chinese Exclusion Case), 130 U.S. 581 (1889)</w:t>
+        </w:r>
+      </w:hyperlink>
+      <w:r>
+        <w:rPr/>
+        <w:t xml:space="preserve">, Justia (primary source)</w:t>
+      </w:r>
+    </w:p>
+    <w:p>
+      <w:pPr>
+        <w:spacing w:before="0" w:after="0"/>
+        <w:pStyle w:val="ListParagraph"/>
+        <w:ind w:left="720"/>
+        <w:numPr>
+          <w:ilvl w:val="0"/>
+          <w:numId w:val="6"/>
+        </w:numPr>
+      </w:pPr>
+      <w:hyperlink w:history="1" r:id="rId53">
+        <w:r>
+          <w:rPr>
+            <w:color w:val="0000FF" w:themeColor="hyperlink"/>
+            <w:u w:val="single"/>
+          </w:rPr>
+          <w:t xml:space="preserve">Chinese Exclusion Act, 1882</w:t>
+        </w:r>
+      </w:hyperlink>
+      <w:r>
+        <w:rPr/>
+        <w:t xml:space="preserve">, National Archives (primary source)</w:t>
+      </w:r>
+    </w:p>
+    <w:p>
+      <w:pPr>
+        <w:spacing w:before="0" w:after="0"/>
+        <w:pStyle w:val="ListParagraph"/>
+        <w:ind w:left="720"/>
+        <w:numPr>
+          <w:ilvl w:val="0"/>
+          <w:numId w:val="6"/>
+        </w:numPr>
+      </w:pPr>
+      <w:hyperlink w:history="1" r:id="rId54">
+        <w:r>
+          <w:rPr>
+            <w:color w:val="0000FF" w:themeColor="hyperlink"/>
+            <w:u w:val="single"/>
+          </w:rPr>
+          <w:t xml:space="preserve">Immigration through Angel Island</w:t>
+        </w:r>
+      </w:hyperlink>
+      <w:r>
+        <w:rPr/>
+        <w:t xml:space="preserve">, Digital Public Library of America (primary source set)</w:t>
+      </w:r>
+    </w:p>
+    <w:p>
+      <w:pPr>
+        <w:spacing w:before="0" w:after="0"/>
+        <w:pStyle w:val="ListParagraph"/>
+        <w:ind w:left="720"/>
+        <w:numPr>
+          <w:ilvl w:val="0"/>
+          <w:numId w:val="6"/>
+        </w:numPr>
+      </w:pPr>
+      <w:hyperlink w:history="1" r:id="rId55">
+        <w:r>
+          <w:rPr>
+            <w:color w:val="0000FF" w:themeColor="hyperlink"/>
+            <w:u w:val="single"/>
+          </w:rPr>
+          <w:t xml:space="preserve">Political Cartoons about the “Chinese Question,”</w:t>
+        </w:r>
+      </w:hyperlink>
+      <w:r>
+        <w:rPr/>
+        <w:t xml:space="preserve"> </w:t>
+      </w:r>
+      <w:r>
+        <w:rPr>
+          <w:i/>
+        </w:rPr>
+        <w:t xml:space="preserve">Harper’s Weekly</w:t>
+      </w:r>
+      <w:r>
+        <w:rPr/>
+        <w:t xml:space="preserve"> (primary source collection)</w:t>
+      </w:r>
+    </w:p>
+    <w:p>
+      <w:pPr>
+        <w:spacing w:before="0" w:after="0"/>
+        <w:pStyle w:val="ListParagraph"/>
+        <w:ind w:left="720"/>
+        <w:numPr>
+          <w:ilvl w:val="0"/>
+          <w:numId w:val="6"/>
+        </w:numPr>
+      </w:pPr>
+      <w:r>
+        <w:rPr/>
+        <w:t xml:space="preserve">Theodore Roosevelt, </w:t>
+      </w:r>
+      <w:hyperlink w:history="1" r:id="rId56">
+        <w:r>
+          <w:rPr>
+            <w:color w:val="0000FF" w:themeColor="hyperlink"/>
+            <w:u w:val="single"/>
+          </w:rPr>
+          <w:t xml:space="preserve">True Americanism</w:t>
+        </w:r>
+      </w:hyperlink>
+      <w:r>
+        <w:rPr/>
+        <w:t xml:space="preserve">, 1894, HathiTrust (primary source)</w:t>
+      </w:r>
+    </w:p>
+    <w:p>
+      <w:pPr>
+        <w:spacing w:before="0" w:after="0"/>
+        <w:pStyle w:val="ListParagraph"/>
+        <w:ind w:left="720"/>
+        <w:numPr>
+          <w:ilvl w:val="0"/>
+          <w:numId w:val="6"/>
+        </w:numPr>
+      </w:pPr>
+      <w:hyperlink w:history="1" r:id="rId57">
+        <w:r>
+          <w:rPr>
+            <w:color w:val="0000FF" w:themeColor="hyperlink"/>
+            <w:u w:val="single"/>
             <w:i/>
           </w:rPr>
-          <w:t xml:space="preserve">Chae Chan Ping v. United States</w:t>
-        </w:r>
-        <w:r>
-          <w:rPr>
-            <w:color w:val="0000FF" w:themeColor="hyperlink"/>
-            <w:u w:val="single"/>
-          </w:rPr>
-          <w:t xml:space="preserve"> (The Chinese Exclusion Case), 1889</w:t>
-        </w:r>
-      </w:hyperlink>
-      <w:r>
-        <w:rPr/>
-        <w:t xml:space="preserve"> (primary source)</w:t>
+          <w:t xml:space="preserve">United States v. Wong Kim Ark</w:t>
+        </w:r>
+        <w:r>
+          <w:rPr>
+            <w:color w:val="0000FF" w:themeColor="hyperlink"/>
+            <w:u w:val="single"/>
+          </w:rPr>
+          <w:t xml:space="preserve">,</w:t>
+        </w:r>
+      </w:hyperlink>
+      <w:r>
+        <w:rPr/>
+        <w:t xml:space="preserve"> 1897, Densho (primary source)</w:t>
       </w:r>
     </w:p>
     <w:p>
@@ -2502,18 +2653,32 @@
           <w:numId w:val="6"/>
         </w:numPr>
       </w:pPr>
-      <w:hyperlink w:history="1" r:id="rId53">
-        <w:r>
-          <w:rPr>
-            <w:color w:val="0000FF" w:themeColor="hyperlink"/>
-            <w:u w:val="single"/>
-          </w:rPr>
-          <w:t xml:space="preserve">Chinese Exclusion Act, 1882</w:t>
-        </w:r>
-      </w:hyperlink>
-      <w:r>
-        <w:rPr/>
-        <w:t xml:space="preserve">, National Archives (primary source)</w:t>
+      <w:r>
+        <w:rPr/>
+        <w:t xml:space="preserve">Irene Hsu “</w:t>
+      </w:r>
+      <w:hyperlink w:history="1" r:id="rId58">
+        <w:r>
+          <w:rPr>
+            <w:color w:val="0000FF" w:themeColor="hyperlink"/>
+            <w:u w:val="single"/>
+          </w:rPr>
+          <w:t xml:space="preserve">The Echoes of Chinese Exclusion</w:t>
+        </w:r>
+      </w:hyperlink>
+      <w:r>
+        <w:rPr/>
+        <w:t xml:space="preserve">,” </w:t>
+      </w:r>
+      <w:r>
+        <w:rPr>
+          <w:i/>
+        </w:rPr>
+        <w:t xml:space="preserve">The New Republic</w:t>
+      </w:r>
+      <w:r>
+        <w:rPr/>
+        <w:t xml:space="preserve">, June 28, 2018 (public-facing article)</w:t>
       </w:r>
     </w:p>
     <w:p>
@@ -2526,18 +2691,32 @@
           <w:numId w:val="6"/>
         </w:numPr>
       </w:pPr>
-      <w:hyperlink w:history="1" r:id="rId54">
-        <w:r>
-          <w:rPr>
-            <w:color w:val="0000FF" w:themeColor="hyperlink"/>
-            <w:u w:val="single"/>
-          </w:rPr>
-          <w:t xml:space="preserve">Immigration through Angel Island</w:t>
-        </w:r>
-      </w:hyperlink>
-      <w:r>
-        <w:rPr/>
-        <w:t xml:space="preserve">, Digital Public Library of America (primary source set)</w:t>
+      <w:r>
+        <w:rPr/>
+        <w:t xml:space="preserve">Hector Alejandro Arzate, “</w:t>
+      </w:r>
+      <w:hyperlink w:history="1" r:id="rId59">
+        <w:r>
+          <w:rPr>
+            <w:color w:val="0000FF" w:themeColor="hyperlink"/>
+            <w:u w:val="single"/>
+          </w:rPr>
+          <w:t xml:space="preserve">Chinese Immigrants Were Forced Out of Eureka in 1885 – Here’s How Locals Are Making That History Known</w:t>
+        </w:r>
+      </w:hyperlink>
+      <w:r>
+        <w:rPr/>
+        <w:t xml:space="preserve">,” </w:t>
+      </w:r>
+      <w:r>
+        <w:rPr>
+          <w:i/>
+        </w:rPr>
+        <w:t xml:space="preserve">KQED</w:t>
+      </w:r>
+      <w:r>
+        <w:rPr/>
+        <w:t xml:space="preserve">, October 15, 2021 (public-facing article)</w:t>
       </w:r>
     </w:p>
     <w:p>
@@ -2550,176 +2729,6 @@
           <w:numId w:val="6"/>
         </w:numPr>
       </w:pPr>
-      <w:hyperlink w:history="1" r:id="rId55">
-        <w:r>
-          <w:rPr>
-            <w:color w:val="0000FF" w:themeColor="hyperlink"/>
-            <w:u w:val="single"/>
-          </w:rPr>
-          <w:t xml:space="preserve">Political Cartoons about the “Chinese Question,”</w:t>
-        </w:r>
-      </w:hyperlink>
-      <w:r>
-        <w:rPr/>
-        <w:t xml:space="preserve"> </w:t>
-      </w:r>
-      <w:r>
-        <w:rPr>
-          <w:i/>
-        </w:rPr>
-        <w:t xml:space="preserve">Harper’s Weekly</w:t>
-      </w:r>
-      <w:r>
-        <w:rPr/>
-        <w:t xml:space="preserve"> (primary source collection)</w:t>
-      </w:r>
-    </w:p>
-    <w:p>
-      <w:pPr>
-        <w:spacing w:before="0" w:after="0"/>
-        <w:pStyle w:val="ListParagraph"/>
-        <w:ind w:left="720"/>
-        <w:numPr>
-          <w:ilvl w:val="0"/>
-          <w:numId w:val="6"/>
-        </w:numPr>
-      </w:pPr>
-      <w:r>
-        <w:rPr/>
-        <w:t xml:space="preserve">Theodore Roosevelt, </w:t>
-      </w:r>
-      <w:hyperlink w:history="1" r:id="rId56">
-        <w:r>
-          <w:rPr>
-            <w:color w:val="0000FF" w:themeColor="hyperlink"/>
-            <w:u w:val="single"/>
-          </w:rPr>
-          <w:t xml:space="preserve">True Americanism</w:t>
-        </w:r>
-      </w:hyperlink>
-      <w:r>
-        <w:rPr/>
-        <w:t xml:space="preserve">, 1894, HathiTrust (primary source)</w:t>
-      </w:r>
-    </w:p>
-    <w:p>
-      <w:pPr>
-        <w:spacing w:before="0" w:after="0"/>
-        <w:pStyle w:val="ListParagraph"/>
-        <w:ind w:left="720"/>
-        <w:numPr>
-          <w:ilvl w:val="0"/>
-          <w:numId w:val="6"/>
-        </w:numPr>
-      </w:pPr>
-      <w:hyperlink w:history="1" r:id="rId57">
-        <w:r>
-          <w:rPr>
-            <w:color w:val="0000FF" w:themeColor="hyperlink"/>
-            <w:u w:val="single"/>
-            <w:i/>
-          </w:rPr>
-          <w:t xml:space="preserve">United States v. Wong Kim Ark</w:t>
-        </w:r>
-        <w:r>
-          <w:rPr>
-            <w:color w:val="0000FF" w:themeColor="hyperlink"/>
-            <w:u w:val="single"/>
-          </w:rPr>
-          <w:t xml:space="preserve">,</w:t>
-        </w:r>
-      </w:hyperlink>
-      <w:r>
-        <w:rPr/>
-        <w:t xml:space="preserve"> 1897, Densho (primary source)</w:t>
-      </w:r>
-    </w:p>
-    <w:p>
-      <w:pPr>
-        <w:spacing w:before="0" w:after="0"/>
-        <w:pStyle w:val="ListParagraph"/>
-        <w:ind w:left="720"/>
-        <w:numPr>
-          <w:ilvl w:val="0"/>
-          <w:numId w:val="6"/>
-        </w:numPr>
-      </w:pPr>
-      <w:r>
-        <w:rPr/>
-        <w:t xml:space="preserve">Irene Hsu “</w:t>
-      </w:r>
-      <w:hyperlink w:history="1" r:id="rId58">
-        <w:r>
-          <w:rPr>
-            <w:color w:val="0000FF" w:themeColor="hyperlink"/>
-            <w:u w:val="single"/>
-          </w:rPr>
-          <w:t xml:space="preserve">The Echoes of Chinese Exclusion</w:t>
-        </w:r>
-      </w:hyperlink>
-      <w:r>
-        <w:rPr/>
-        <w:t xml:space="preserve">,” </w:t>
-      </w:r>
-      <w:r>
-        <w:rPr>
-          <w:i/>
-        </w:rPr>
-        <w:t xml:space="preserve">The New Republic</w:t>
-      </w:r>
-      <w:r>
-        <w:rPr/>
-        <w:t xml:space="preserve">, June 28, 2018(public-facing article)</w:t>
-      </w:r>
-    </w:p>
-    <w:p>
-      <w:pPr>
-        <w:spacing w:before="0" w:after="0"/>
-        <w:pStyle w:val="ListParagraph"/>
-        <w:ind w:left="720"/>
-        <w:numPr>
-          <w:ilvl w:val="0"/>
-          <w:numId w:val="6"/>
-        </w:numPr>
-      </w:pPr>
-      <w:r>
-        <w:rPr/>
-        <w:t xml:space="preserve">Hector Alejandro Arzate, “</w:t>
-      </w:r>
-      <w:hyperlink w:history="1" r:id="rId59">
-        <w:r>
-          <w:rPr>
-            <w:color w:val="0000FF" w:themeColor="hyperlink"/>
-            <w:u w:val="single"/>
-          </w:rPr>
-          <w:t xml:space="preserve">Chinese Immigrants Were Forced Out of Eureka in 1885 – Here’s How Locals Are Making That History Known</w:t>
-        </w:r>
-      </w:hyperlink>
-      <w:r>
-        <w:rPr/>
-        <w:t xml:space="preserve">,” </w:t>
-      </w:r>
-      <w:r>
-        <w:rPr>
-          <w:i/>
-        </w:rPr>
-        <w:t xml:space="preserve">KQED</w:t>
-      </w:r>
-      <w:r>
-        <w:rPr/>
-        <w:t xml:space="preserve">, October 15, 2021 (public-facing article)</w:t>
-      </w:r>
-    </w:p>
-    <w:p>
-      <w:pPr>
-        <w:spacing w:before="0" w:after="0"/>
-        <w:pStyle w:val="ListParagraph"/>
-        <w:ind w:left="720"/>
-        <w:numPr>
-          <w:ilvl w:val="0"/>
-          <w:numId w:val="6"/>
-        </w:numPr>
-      </w:pPr>
       <w:hyperlink w:history="1" r:id="rId60">
         <w:r>
           <w:rPr>
@@ -2733,6 +2742,14 @@
         <w:rPr/>
         <w:t xml:space="preserve">, Thomas Nast Cartoons (digital history)</w:t>
       </w:r>
+    </w:p>
+    <w:p>
+      <w:pPr>
+        <w:pBdr>
+          <w:bottom w:val="single" w:sz="6" w:space="1" w:color="auto"/>
+        </w:pBdr>
+        <w:spacing w:before="0" w:after="0" w:line="1" w:lineRule="auto"/>
+      </w:pPr>
     </w:p>
     <w:p>
       <w:pPr>
@@ -2748,7 +2765,7 @@
       <w:pPr/>
       <w:r>
         <w:rPr/>
-        <w:t xml:space="preserve">Beginning in the 1890s, an expanding and industrializing United States experienced a dramatic increase in immigration from throughout the world. Immigrants from southern and eastern Europe arrived in substantial numbers, including Italians and Eastern European Jews. Many of these immigrants passed through the newly opened immigration station at Ellis Island. Although the legal admission of Chinese laborers had been cut off by exclusion laws, Chinese migrants continued to enter the country. Immigrants from Japan, South Asia, and the newly acquired US territory of the Philippines arrived as well. Within the Americas, Mexican immigration increased during the Mexican Revolution of the 1910s. Caribbean migration was also significant, particularly migrants from the British West Indies who reconfigured the landscape of Black American politics and culture. In smaller numbers, immigrants from the Ottoman Empire arrived in the US, including Arab immigrants from Greater Syria, as did Cape Verdean immigrants from off the coast of Africa.</w:t>
+        <w:t xml:space="preserve">Beginning in the 1890s, an expanding and industrializing United States experienced a dramatic increase in immigration from throughout the world. Immigrants from southern and eastern Europe arrived in substantial numbers, including Italians and Eastern European Jews. Many of these immigrants passed through the newly opened immigration station at Ellis Island. Although the legal admission of Chinese laborers had been cut off by exclusion laws, Chinese migrants continued to enter the country. Immigrants from Japan, South Asia, and the newly acquired US territory of the Philippines arrived as well. Within the Americas, Mexican immigration increased during the Mexican Revolution (1910–1920). Caribbean migration was also significant, particularly migrants from the British West Indies who reconfigured the landscape of Black American politics and culture. In smaller numbers, immigrants from the Ottoman Empire arrived in the United States, including Arab immigrants from Greater Syria, as did Cape Verdean immigrants from off the coast of Africa.</w:t>
       </w:r>
     </w:p>
     <w:p>
@@ -2798,7 +2815,7 @@
       </w:pPr>
       <w:r>
         <w:rPr/>
-        <w:t xml:space="preserve">Edward E. Curtis, </w:t>
+        <w:t xml:space="preserve">Edward E. Curtis IV, </w:t>
       </w:r>
       <w:r>
         <w:rPr>
@@ -2929,7 +2946,7 @@
         <w:rPr>
           <w:i/>
         </w:rPr>
-        <w:t xml:space="preserve">Barbarian Virtues: The United States Encounters Foreign Peoples at Home and Abroad</w:t>
+        <w:t xml:space="preserve">Barbarian Virtues: The United States Encounters Foreign Peoples at Home and Abroad, 1876–1917</w:t>
       </w:r>
       <w:r>
         <w:rPr/>
@@ -3168,7 +3185,7 @@
       </w:pPr>
       <w:r>
         <w:rPr/>
-        <w:t xml:space="preserve">Scholarship</w:t>
+        <w:t xml:space="preserve">Resources</w:t>
       </w:r>
     </w:p>
     <w:p>
@@ -3377,6 +3394,14 @@
         <w:rPr/>
         <w:t xml:space="preserve">, Digital Public Library of America (primary source set)</w:t>
       </w:r>
+    </w:p>
+    <w:p>
+      <w:pPr>
+        <w:pBdr>
+          <w:bottom w:val="single" w:sz="6" w:space="1" w:color="auto"/>
+        </w:pBdr>
+        <w:spacing w:before="0" w:after="0" w:line="1" w:lineRule="auto"/>
+      </w:pPr>
     </w:p>
     <w:p>
       <w:pPr>
@@ -3392,7 +3417,7 @@
       <w:pPr/>
       <w:r>
         <w:rPr/>
-        <w:t xml:space="preserve">Growing xenophobia and entrenched ideas of immigrants’ racial inferiority led the federal government to pass a series of restrictive immigration laws in the late 19th and early 20th centuries. The Page Act of 1875, the Chinese Exclusion Act of 1882, and the general Immigration Act of 1882 marked the expansion of federal immigration control. By the early 20th century, US immigration law prohibited the admission of an array of foreigners: Chinese laborers, those with mental illnesses or contagious diseases, people likely to become public charges, those with criminal convictions, and other immigrants deemed “undesirable.” The Immigration Act of 1917 excluded immigrants from an “Asiatic barred zone” and required all immigrants to pass a literacy test. The growing legal architecture of exclusion culminated in the Immigration Act of 1924, also known as the Johnson-Reed Act, which created a national-origins quota system that dramatically reduced southern and eastern European immigration and virtually suspended all Asian immigration. Mexican immigrants (and others from independent nations in the Western Hemisphere) did not face numerical restrictions in the 1924 legislation, as lobbyists successfully argued that Mexican labor was essential to the agricultural industry, but the administrative systems developed to enforce immigration restriction significantly impacted migrants from Mexico and elsewhere in Latin America and the Caribbean.</w:t>
+        <w:t xml:space="preserve">Growing xenophobia and entrenched ideas of immigrants’ racial inferiority led the federal government to pass a series of restrictive immigration laws in the late nineteenth and early twentieth centuries. The Page Act of 1875, the Chinese Exclusion Act of 1882, and the general Immigration Act of 1882 marked the expansion of federal immigration control. By the early twentieth century, US immigration law prohibited the admission of an array of foreigners: Chinese laborers, those with mental illnesses or contagious diseases, people likely to become public charges, those with criminal convictions, and other immigrants deemed “undesirable.” The Immigration Act of 1917 excluded immigrants from an “Asiatic barred zone” and required all immigrants to pass a literacy test. The growing legal architecture of exclusion culminated in the Immigration Act of 1924, also known as the Johnson-Reed Act, which created a national-origins quota system that dramatically reduced southern and eastern European immigration and virtually suspended all Asian immigration. Mexican immigrants (and others from independent nations in the Western Hemisphere) did not face numerical restrictions in the 1924 legislation, as lobbyists successfully argued that Mexican labor was essential to the agricultural industry, but the administrative systems developed to enforce immigration restriction significantly impacted migrants from Mexico and elsewhere in Latin America and the Caribbean.</w:t>
       </w:r>
     </w:p>
     <w:p>
@@ -3767,7 +3792,7 @@
       </w:pPr>
       <w:r>
         <w:rPr/>
-        <w:t xml:space="preserve">Maddalena Marinari, Madeline Y. Hsu, and Maria Cristina García, eds., </w:t>
+        <w:t xml:space="preserve">Maddalena Marinari, Madeline Y. Hsu, and María Cristina García, eds., </w:t>
       </w:r>
       <w:r>
         <w:rPr>
@@ -3817,7 +3842,7 @@
       </w:pPr>
       <w:r>
         <w:rPr/>
-        <w:t xml:space="preserve">Ivón Padilla-Rodríguez, “‘Los Hijos Son La Riqueza Del Pobre:’Mexican Child Migration and the Making of Domestic (Im)migrant Exclusion, 1937–1960,” </w:t>
+        <w:t xml:space="preserve">Ivón Padilla-Rodríguez, “‘Los Hijos Son La Riqueza Del Pobre:’ Mexican Child Migration and the Making of Domestic (Im)migrant Exclusion, 1937–1960,” </w:t>
       </w:r>
       <w:r>
         <w:rPr>
@@ -3930,7 +3955,7 @@
             <w:color w:val="0000FF" w:themeColor="hyperlink"/>
             <w:u w:val="single"/>
           </w:rPr>
-          <w:t xml:space="preserve">Immigration Quotas, 1925-1927</w:t>
+          <w:t xml:space="preserve">Who Was Shut Out?: Immigration Quotas, 1925–1927</w:t>
         </w:r>
       </w:hyperlink>
       <w:r>
@@ -4001,16 +4026,8 @@
           <w:rPr>
             <w:color w:val="0000FF" w:themeColor="hyperlink"/>
             <w:u w:val="single"/>
-            <w:i/>
-          </w:rPr>
-          <w:t xml:space="preserve">U.S. v. Bhagat Singh Thind</w:t>
-        </w:r>
-        <w:r>
-          <w:rPr>
-            <w:color w:val="0000FF" w:themeColor="hyperlink"/>
-            <w:u w:val="single"/>
-          </w:rPr>
-          <w:t xml:space="preserve"> (1923)</w:t>
+          </w:rPr>
+          <w:t xml:space="preserve">Not All Caucasians Are White: The Supreme Court Rejects Citizenship for Asian Indians</w:t>
         </w:r>
       </w:hyperlink>
       <w:r>
@@ -4034,7 +4051,7 @@
             <w:color w:val="0000FF" w:themeColor="hyperlink"/>
             <w:u w:val="single"/>
           </w:rPr>
-          <w:t xml:space="preserve">Repatriation and Deportation of Mexicans 1932-1936</w:t>
+          <w:t xml:space="preserve">Repatriation and Deportation of Mexicans 1932–1936</w:t>
         </w:r>
       </w:hyperlink>
       <w:r>
@@ -4082,13 +4099,21 @@
             <w:color w:val="0000FF" w:themeColor="hyperlink"/>
             <w:u w:val="single"/>
           </w:rPr>
-          <w:t xml:space="preserve">Dollar a Day, Ten Cents a Dance</w:t>
+          <w:t xml:space="preserve">Dollar a Day, 10 Cents a Dance</w:t>
         </w:r>
       </w:hyperlink>
       <w:r>
         <w:rPr/>
         <w:t xml:space="preserve"> (documentary)</w:t>
       </w:r>
+    </w:p>
+    <w:p>
+      <w:pPr>
+        <w:pBdr>
+          <w:bottom w:val="single" w:sz="6" w:space="1" w:color="auto"/>
+        </w:pBdr>
+        <w:spacing w:before="0" w:after="0" w:line="1" w:lineRule="auto"/>
+      </w:pPr>
     </w:p>
     <w:p>
       <w:pPr>
@@ -4104,7 +4129,7 @@
       <w:pPr/>
       <w:r>
         <w:rPr/>
-        <w:t xml:space="preserve">Empire – the exercise of one nation’s power and influence in ways that shape hierarchies of belonging and exert control over the peoples, places, and resources of other nations – has long influenced the role of the United States in the wider world and the ways people have moved through it. The arrival of settlers from Europe played a pivotal role in continental expansion in the United States and the dispossession of Indigenous peoples that made it possible. Competition for natural resources between the United States and other global empires shaped labor migrations within and beyond American borders. The US acquisition of foreign territories moved the nation’s borders across people and moved people across borders. And the intervention of the United States in the affairs of other countries has led to mass displacement – raising difficult questions about the country’s obligation to welcome immigrants and refugees whose reasons for leaving their homes have been shaped by U.S. imperialism.</w:t>
+        <w:t xml:space="preserve">Empire—the exercise of one nation’s power and influence in ways that shape hierarchies of belonging and exert control over the peoples, places, and resources of other nations—has long influenced the role of the United States in the wider world and the ways people have moved through it. The arrival of settlers from Europe played a pivotal role in continental expansion in the United States and the dispossession of Indigenous peoples that made it possible. Competition for natural resources between the United States and other global empires shaped labor migrations within and beyond American borders. The US acquisition of foreign territories moved the nation’s borders across people and moved people across borders. And the intervention of the United States in the affairs of other countries has led to mass displacement – raising difficult questions about the country’s obligation to welcome immigrants and refugees whose reasons for leaving their homes have been shaped by US imperialism.</w:t>
       </w:r>
     </w:p>
     <w:p>
@@ -4414,7 +4439,7 @@
       </w:r>
       <w:r>
         <w:rPr/>
-        <w:t xml:space="preserve"> 123, no.2 (April 2018): 393–438</w:t>
+        <w:t xml:space="preserve"> 123, no. 2 (April 2018): 393–438</w:t>
       </w:r>
     </w:p>
     <w:p>
@@ -4529,13 +4554,13 @@
       </w:pPr>
       <w:r>
         <w:rPr/>
-        <w:t xml:space="preserve">María L. Quintana, </w:t>
-      </w:r>
-      <w:r>
-        <w:rPr>
-          <w:i/>
-        </w:rPr>
-        <w:t xml:space="preserve">Contracting Freedom: Race, Empire, and U.S. Guestworker Programs</w:t>
+        <w:t xml:space="preserve">Maria L. Quintana, </w:t>
+      </w:r>
+      <w:r>
+        <w:rPr>
+          <w:i/>
+        </w:rPr>
+        <w:t xml:space="preserve">Contracting Freedom: Race, Empire, and US Guestworker Programs</w:t>
       </w:r>
       <w:r>
         <w:rPr/>
@@ -4735,13 +4760,17 @@
           <w:numId w:val="12"/>
         </w:numPr>
       </w:pPr>
+      <w:r>
+        <w:rPr/>
+        <w:t xml:space="preserve">Pedro Pietri, </w:t>
+      </w:r>
       <w:hyperlink w:history="1" r:id="rId79">
         <w:r>
           <w:rPr>
             <w:color w:val="0000FF" w:themeColor="hyperlink"/>
             <w:u w:val="single"/>
           </w:rPr>
-          <w:t xml:space="preserve">Pietri, Puerto Rican Obituary</w:t>
+          <w:t xml:space="preserve">Puerto Rican Obituary</w:t>
         </w:r>
       </w:hyperlink>
       <w:r>
@@ -4807,18 +4836,22 @@
           <w:numId w:val="12"/>
         </w:numPr>
       </w:pPr>
+      <w:r>
+        <w:rPr/>
+        <w:t xml:space="preserve">"</w:t>
+      </w:r>
       <w:hyperlink w:history="1" r:id="rId82">
         <w:r>
           <w:rPr>
             <w:color w:val="0000FF" w:themeColor="hyperlink"/>
             <w:u w:val="single"/>
           </w:rPr>
-          <w:t xml:space="preserve">“The History of American Imperialism, From Bloody Conquest to Bird Poop,”</w:t>
-        </w:r>
-      </w:hyperlink>
-      <w:r>
-        <w:rPr/>
-        <w:t xml:space="preserve"> </w:t>
+          <w:t xml:space="preserve">The History of American Imperialism, From Bloody Conquest to Bird Poop</w:t>
+        </w:r>
+      </w:hyperlink>
+      <w:r>
+        <w:rPr/>
+        <w:t xml:space="preserve">,” </w:t>
       </w:r>
       <w:r>
         <w:rPr>
@@ -5016,6 +5049,16 @@
         <w:rPr/>
         <w:t xml:space="preserve">, 1899, Library of Congress (primary source)</w:t>
       </w:r>
+    </w:p>
+    <w:p>
+      <w:pPr>
+        <w:pStyle w:val="ListParagraph"/>
+        <w:numPr>
+          <w:ilvl w:val="0"/>
+          <w:numId w:val="0"/>
+        </w:numPr>
+        <w:ind w:left="720"/>
+      </w:pPr>
     </w:p>
     <w:p>
       <w:pPr>
@@ -5031,7 +5074,7 @@
       <w:pPr/>
       <w:r>
         <w:rPr/>
-        <w:t xml:space="preserve">Citizenship is often depicted as an immigrant’s natural goal: a mark of successful incorporation or even assimilation. Citizenship can result in an increase in political rights and access to a protected status that enables some migrants to settle within the U.S. without fear of deportation. State production of citizenship, however, has been uneven and mediated by gender, race, and class. Many migrants who have accessed citizenship, or had citizenship ascribed to them, have faced the limits of its protections, and juridical citizenship has also functioned as a site of dispossession and surveillance. Racialized migrants and their descendants have often been precluded from accessing the fruits of legal belonging. In response, migrants have expanded the concept of citizenship through social and political actions that have focused on the inherent worth and dignity of human beings, denouncing political and legal efforts to stigmatize, detain, and deport them, and expanding the scope of their legal rights.</w:t>
+        <w:t xml:space="preserve">Citizenship is often depicted as an immigrant’s natural goal: a mark of successful incorporation or even assimilation. Citizenship can result in an increase in political rights and access to a protected status that enables some migrants to settle within the United States without fear of deportation. State production of citizenship, however, has been uneven and mediated by gender, race, and class. Many migrants who have accessed citizenship, or had citizenship ascribed to them, have faced the limits of its protections, and juridical citizenship has also functioned as a site of dispossession and surveillance. Racialized migrants and their descendants have often been precluded from accessing the fruits of legal belonging. In response, migrants have expanded the concept of citizenship through social and political actions that have focused on the inherent worth and dignity of human beings, denouncing political and legal efforts to stigmatize, detain, and deport them, and expanding the scope of their legal rights.</w:t>
       </w:r>
     </w:p>
     <w:p>
@@ -5181,7 +5224,7 @@
       </w:pPr>
       <w:r>
         <w:rPr/>
-        <w:t xml:space="preserve">Hardeep Dhillon and Maddalena Marinari, “Networks of Power and Relationality: US Citizenship and Migration in the Twentieth Century," </w:t>
+        <w:t xml:space="preserve">Hardeep Dhillon and Maddalena Marinari, “Networks of Power and Relationality: US Citizenship and Migration in the Twentieth Century,” </w:t>
       </w:r>
       <w:r>
         <w:rPr>
@@ -5191,7 +5234,7 @@
       </w:r>
       <w:r>
         <w:rPr/>
-        <w:t xml:space="preserve"> 44, no. 4 (2025): 5-13</w:t>
+        <w:t xml:space="preserve"> 44, no. 4 (2025): 5–13</w:t>
       </w:r>
     </w:p>
     <w:p>
@@ -5331,7 +5374,7 @@
       </w:pPr>
       <w:r>
         <w:rPr/>
-        <w:t xml:space="preserve">Madeline Y. Hsu and Ellen D. Wu, “Smoke and Mirrors": Conditional Inclusion, Model Minorities, and the Pre-1965 Dismantling of Asian Exclusion,” </w:t>
+        <w:t xml:space="preserve">Madeline Y. Hsu and Ellen D. Wu, “‘Smoke and Mirrors’: Conditional Inclusion, Model Minorities, and the Pre-1965 Dismantling of Asian Exclusion,” </w:t>
       </w:r>
       <w:r>
         <w:rPr>
@@ -5341,7 +5384,7 @@
       </w:r>
       <w:r>
         <w:rPr/>
-        <w:t xml:space="preserve"> 34, no. 4 (Summer 2015): 43-65</w:t>
+        <w:t xml:space="preserve"> 34, no. 4 (Summer 2015): 43–65</w:t>
       </w:r>
     </w:p>
     <w:p>
@@ -5537,7 +5580,7 @@
         <w:rPr>
           <w:i/>
         </w:rPr>
-        <w:t xml:space="preserve">Disparate Regimes: Nativist Politics, Alienage Law, and Citizenship Rights in the United States, 1865-1965</w:t>
+        <w:t xml:space="preserve">Disparate Regimes: Nativist Politics, Alienage Law, and Citizenship Rights in the United States, 1865–1965</w:t>
       </w:r>
       <w:r>
         <w:rPr/>
@@ -5669,7 +5712,7 @@
             <w:color w:val="0000FF" w:themeColor="hyperlink"/>
             <w:u w:val="single"/>
           </w:rPr>
-          <w:t xml:space="preserve">Hirabayashi v. US Hirabayashi v. United States</w:t>
+          <w:t xml:space="preserve">Kiyoshi Hirabayashi v. United States</w:t>
         </w:r>
       </w:hyperlink>
       <w:r>
@@ -5769,7 +5812,7 @@
             <w:color w:val="0000FF" w:themeColor="hyperlink"/>
             <w:u w:val="single"/>
           </w:rPr>
-          <w:t xml:space="preserve">Minoru Yasui v. United States (320 US 115, June 21, 1943)</w:t>
+          <w:t xml:space="preserve">Minoru Yasui v. United States</w:t>
         </w:r>
       </w:hyperlink>
       <w:r>
@@ -6059,6 +6102,14 @@
         <w:rPr/>
         <w:t xml:space="preserve">, Digital Public Library of America (primary source set)</w:t>
       </w:r>
+    </w:p>
+    <w:p>
+      <w:pPr>
+        <w:pBdr>
+          <w:bottom w:val="single" w:sz="6" w:space="1" w:color="auto"/>
+        </w:pBdr>
+        <w:spacing w:before="0" w:after="0" w:line="1" w:lineRule="auto"/>
+      </w:pPr>
     </w:p>
     <w:p>
       <w:pPr>
@@ -6509,7 +6560,7 @@
       </w:r>
       <w:r>
         <w:rPr/>
-        <w:t xml:space="preserve"> (1993)</w:t>
+        <w:t xml:space="preserve"> (1997)</w:t>
       </w:r>
     </w:p>
     <w:p>
@@ -6568,7 +6619,7 @@
       </w:hyperlink>
       <w:r>
         <w:rPr/>
-        <w:t xml:space="preserve">, Bracero History Archive (primary source collection)</w:t>
+        <w:t xml:space="preserve">, Digital Public Library of America (primary source collection)</w:t>
       </w:r>
     </w:p>
     <w:p>
@@ -6659,6 +6710,10 @@
           <w:numId w:val="16"/>
         </w:numPr>
       </w:pPr>
+      <w:r>
+        <w:rPr/>
+        <w:t xml:space="preserve">Julie M. Weise, </w:t>
+      </w:r>
       <w:hyperlink w:history="1" r:id="rId110">
         <w:r>
           <w:rPr>
@@ -6670,7 +6725,7 @@
       </w:hyperlink>
       <w:r>
         <w:rPr/>
-        <w:t xml:space="preserve">, Julie M. Weise (primary source collection, companion to the book of the same name)</w:t>
+        <w:t xml:space="preserve">, University of North Carolina Press (primary source collection, companion to the book of the same name)</w:t>
       </w:r>
     </w:p>
     <w:p>
@@ -6696,6 +6751,16 @@
         <w:rPr/>
         <w:t xml:space="preserve">, American Experience (documentary)</w:t>
       </w:r>
+    </w:p>
+    <w:p>
+      <w:pPr>
+        <w:pStyle w:val="ListParagraph"/>
+        <w:numPr>
+          <w:ilvl w:val="0"/>
+          <w:numId w:val="0"/>
+        </w:numPr>
+        <w:ind w:left="720"/>
+      </w:pPr>
     </w:p>
     <w:p>
       <w:pPr>
@@ -6711,7 +6776,7 @@
       <w:pPr/>
       <w:r>
         <w:rPr/>
-        <w:t xml:space="preserve">After World War II, new pressures related to global decolonization and U.S. foreign affairs during the Cold War helped transform immigration policies. No less important, domestic civil rights activism pushed the nation to reject racially discriminatory restrictions on immigration, including Asian exclusion. In this context, the 1965 Immigration Act helped increase immigration, over the next decades, of people from Latin America, Asia, Africa, as well as Europe. However, the Act also introduced the first numerical limitations on Latin American migration, denying millions of immigrants a legal pathway. While immigration to the United States had always been global in scope, post-1965 immigration brought diversity on a new scale. As the United States became a global superpower, its economy and culture were strengthened by immigrant workers, consumers, and family members. The civil rights movement’s triumphs ensured that newcomers and their children arrived in a United States that was formally committed to equality; in reality, immigrants would continue to fight for recognition of their rights and dignity.</w:t>
+        <w:t xml:space="preserve">After World War II, new pressures related to global decolonization and US foreign affairs during the Cold War helped transform immigration policies. No less important, domestic civil rights activism pushed the nation to reject racially discriminatory restrictions on immigration, including Asian exclusion. In this context, the 1965 Immigration Act helped increase immigration, over the next decades, of people from Latin America, Asia, Africa, and Europe. However, the Act also introduced the first numerical limitations on Latin American migration, denying millions of immigrants a legal pathway. While immigration to the United States had always been global in scope, post-1965 immigration brought diversity on a new scale. As the United States became a global superpower, its economy and culture were strengthened by immigrant workers, consumers, and family members. The Civil Rights Movement’s triumphs ensured that newcomers and their children arrived in a United States that was formally committed to equality; in reality, immigrants would continue to fight for recognition of their rights and dignity.</w:t>
       </w:r>
     </w:p>
     <w:p>
@@ -6771,7 +6836,7 @@
       </w:r>
       <w:r>
         <w:rPr/>
-        <w:t xml:space="preserve"> 8 no.1-2, (March 2009): 89-124</w:t>
+        <w:t xml:space="preserve"> 8 no. 1–2, (March 2009): 89–124</w:t>
       </w:r>
     </w:p>
     <w:p>
@@ -7046,7 +7111,7 @@
       </w:r>
       <w:r>
         <w:rPr/>
-        <w:t xml:space="preserve"> 26, no.2 (April 2014): 219-245</w:t>
+        <w:t xml:space="preserve"> 26, no. 2 (April 2014): 219–245</w:t>
       </w:r>
     </w:p>
     <w:p>
@@ -7274,7 +7339,7 @@
             <w:color w:val="0000FF" w:themeColor="hyperlink"/>
             <w:u w:val="single"/>
           </w:rPr>
-          <w:t xml:space="preserve">The 1965 Immigration and Nationality Act</w:t>
+          <w:t xml:space="preserve">Immigration and Nationality Act of 1965</w:t>
         </w:r>
       </w:hyperlink>
       <w:r>
@@ -7307,7 +7372,7 @@
       </w:hyperlink>
       <w:r>
         <w:rPr/>
-        <w:t xml:space="preserve">, January 13, 1965 (primary source)</w:t>
+        <w:t xml:space="preserve">, The American Presidency Project, January 13, 1965 (primary source)</w:t>
       </w:r>
     </w:p>
     <w:p>
@@ -7463,7 +7528,7 @@
       </w:hyperlink>
       <w:r>
         <w:rPr/>
-        <w:t xml:space="preserve">, 2003 (primary source document)</w:t>
+        <w:t xml:space="preserve">, United States Conference of Catholic Bishops, 2003 (primary source document)</w:t>
       </w:r>
     </w:p>
     <w:p>
@@ -7487,7 +7552,7 @@
       </w:hyperlink>
       <w:r>
         <w:rPr/>
-        <w:t xml:space="preserve">, The Center for Global Migration Studies at the University of Maryland, College Park (interview collection)</w:t>
+        <w:t xml:space="preserve">, Center for Global Migration Studies at the University of Maryland, College Park (interview collection)</w:t>
       </w:r>
     </w:p>
     <w:p>
@@ -7535,8 +7600,16 @@
       </w:hyperlink>
       <w:r>
         <w:rPr/>
-        <w:t xml:space="preserve">, University of Washington Library (oral history collection)</w:t>
-      </w:r>
+        <w:t xml:space="preserve">, University of Washington Libraries (oral history collection)</w:t>
+      </w:r>
+    </w:p>
+    <w:p>
+      <w:pPr>
+        <w:pBdr>
+          <w:bottom w:val="single" w:sz="6" w:space="1" w:color="auto"/>
+        </w:pBdr>
+        <w:spacing w:before="0" w:after="0" w:line="1" w:lineRule="auto"/>
+      </w:pPr>
     </w:p>
     <w:p>
       <w:pPr>
@@ -7637,7 +7710,7 @@
       </w:pPr>
       <w:r>
         <w:rPr/>
-        <w:t xml:space="preserve">Julio Capó Jr, “Queering Mariel: Mediating Cold War Foreign Policy and U.S. Citizenship among Cuba's Homosexual Exile Community, 1978-1994,” </w:t>
+        <w:t xml:space="preserve">Julio Capó Jr., “Queering Mariel: Mediating Cold War Foreign Policy and U.S. Citizenship among Cuba's Homosexual Exile Community, 1978–1994,” </w:t>
       </w:r>
       <w:r>
         <w:rPr>
@@ -7647,7 +7720,7 @@
       </w:r>
       <w:r>
         <w:rPr/>
-        <w:t xml:space="preserve"> 29, no. 4 (Summer 2010): 78-106</w:t>
+        <w:t xml:space="preserve"> 29, no. 4 (Summer 2010): 78–106</w:t>
       </w:r>
     </w:p>
     <w:p>
@@ -7693,7 +7766,7 @@
         <w:rPr>
           <w:i/>
         </w:rPr>
-        <w:t xml:space="preserve">Departures An Introduction to Critical Refugee Studies</w:t>
+        <w:t xml:space="preserve">Departures: An Introduction to Critical Refugee Studies</w:t>
       </w:r>
       <w:r>
         <w:rPr/>
@@ -7712,7 +7785,7 @@
       </w:pPr>
       <w:r>
         <w:rPr/>
-        <w:t xml:space="preserve">David FitzGerald, </w:t>
+        <w:t xml:space="preserve">David Scott FitzGerald, </w:t>
       </w:r>
       <w:r>
         <w:rPr>
@@ -7797,7 +7870,7 @@
       </w:r>
       <w:r>
         <w:rPr/>
-        <w:t xml:space="preserve"> 39, no.3 (Spring 2020): 5-16</w:t>
+        <w:t xml:space="preserve"> 39, no. 3 (Spring 2020): 5–16</w:t>
       </w:r>
     </w:p>
     <w:p>
@@ -7872,7 +7945,7 @@
       </w:r>
       <w:r>
         <w:rPr/>
-        <w:t xml:space="preserve"> 109, no.2 (September 2022): 375–387</w:t>
+        <w:t xml:space="preserve"> 109, no. 2 (September 2022): 375–387</w:t>
       </w:r>
     </w:p>
     <w:p>
@@ -8028,7 +8101,7 @@
             <w:color w:val="0000FF" w:themeColor="hyperlink"/>
             <w:u w:val="single"/>
           </w:rPr>
-          <w:t xml:space="preserve">The Lost Boys of Sudan: The Long, Long, Long Road to Fargo</w:t>
+          <w:t xml:space="preserve">The Lost Boys of Sudan; The Long, Long, Long Road to Fargo</w:t>
         </w:r>
       </w:hyperlink>
       <w:r>
@@ -8159,7 +8232,7 @@
       </w:r>
       <w:r>
         <w:rPr/>
-        <w:t xml:space="preserve"> July 8, 2021 (public-facing article)</w:t>
+        <w:t xml:space="preserve">, July 8, 2021 (public-facing article)</w:t>
       </w:r>
     </w:p>
     <w:p>
@@ -8216,7 +8289,7 @@
             <w:color w:val="0000FF" w:themeColor="hyperlink"/>
             <w:u w:val="single"/>
           </w:rPr>
-          <w:t xml:space="preserve">The Other Side of the Water:Immigration and the Promise of Racial Justice</w:t>
+          <w:t xml:space="preserve">The Other Side of the Water: Immigration and the Promise of Racial Justice</w:t>
         </w:r>
       </w:hyperlink>
       <w:r>
@@ -8288,7 +8361,7 @@
             <w:color w:val="0000FF" w:themeColor="hyperlink"/>
             <w:u w:val="single"/>
           </w:rPr>
-          <w:t xml:space="preserve">Cuban Immigration After the Revolution</w:t>
+          <w:t xml:space="preserve">Cuban Immigration After the Revolution 1959-1973</w:t>
         </w:r>
       </w:hyperlink>
       <w:r>
@@ -8343,6 +8416,14 @@
         <w:rPr/>
         <w:t xml:space="preserve">, Calisphere, University of California (oral history project)</w:t>
       </w:r>
+    </w:p>
+    <w:p>
+      <w:pPr>
+        <w:pBdr>
+          <w:bottom w:val="single" w:sz="6" w:space="1" w:color="auto"/>
+        </w:pBdr>
+        <w:spacing w:before="0" w:after="0" w:line="1" w:lineRule="auto"/>
+      </w:pPr>
     </w:p>
     <w:p>
       <w:pPr>
@@ -8804,6 +8885,16 @@
     </w:p>
     <w:p>
       <w:pPr>
+        <w:pStyle w:val="ListParagraph"/>
+        <w:numPr>
+          <w:ilvl w:val="0"/>
+          <w:numId w:val="0"/>
+        </w:numPr>
+        <w:ind w:left="720"/>
+      </w:pPr>
+    </w:p>
+    <w:p>
+      <w:pPr>
         <w:pStyle w:val="Heading2"/>
         <w:keepNext/>
       </w:pPr>
@@ -8847,7 +8938,7 @@
         <w:rPr>
           <w:i/>
         </w:rPr>
-        <w:t xml:space="preserve">The Politics of Care Work Puerto Rican Women Organizing for Social Justice</w:t>
+        <w:t xml:space="preserve">The Politics of Care Work: Puerto Rican Women Organizing for Social Justice</w:t>
       </w:r>
       <w:r>
         <w:rPr/>
@@ -8897,7 +8988,7 @@
         <w:rPr>
           <w:i/>
         </w:rPr>
-        <w:t xml:space="preserve">Dangerous Migration Mexican Labor and the Fight for Immigrant Rights</w:t>
+        <w:t xml:space="preserve">Dangerous Migration: Mexican Labor and the Fight for Immigrant Rights</w:t>
       </w:r>
       <w:r>
         <w:rPr/>
@@ -9066,13 +9157,13 @@
       </w:pPr>
       <w:r>
         <w:rPr/>
-        <w:t xml:space="preserve">Jesse Hoffnung-Garskof, </w:t>
-      </w:r>
-      <w:r>
-        <w:rPr>
-          <w:i/>
-        </w:rPr>
-        <w:t xml:space="preserve">Racial Migrations: New York City and the Revolutionary Politics of the Spanish Caribbean, 1850-1902</w:t>
+        <w:t xml:space="preserve">Jesse E. Hoffnung-Garskof, </w:t>
+      </w:r>
+      <w:r>
+        <w:rPr>
+          <w:i/>
+        </w:rPr>
+        <w:t xml:space="preserve">Racial Migrations: New York City and the Revolutionary Politics of the Spanish Caribbean, 1850–1902</w:t>
       </w:r>
       <w:r>
         <w:rPr/>
@@ -9116,7 +9207,7 @@
       </w:pPr>
       <w:r>
         <w:rPr/>
-        <w:t xml:space="preserve">Lina-María Murillo, </w:t>
+        <w:t xml:space="preserve">Lina-Maria Murillo, </w:t>
       </w:r>
       <w:r>
         <w:rPr>
@@ -9126,7 +9217,7 @@
       </w:r>
       <w:r>
         <w:rPr/>
-        <w:t xml:space="preserve"> (2023)</w:t>
+        <w:t xml:space="preserve"> (2025)</w:t>
       </w:r>
     </w:p>
     <w:p>
@@ -9151,7 +9242,7 @@
       </w:r>
       <w:r>
         <w:rPr/>
-        <w:t xml:space="preserve"> 135 (October 2019): 1-13.</w:t>
+        <w:t xml:space="preserve"> 135 (October 2019): 1–13</w:t>
       </w:r>
     </w:p>
     <w:p>
@@ -9216,7 +9307,7 @@
       </w:pPr>
       <w:r>
         <w:rPr/>
-        <w:t xml:space="preserve">Jorge Ramírez-López, “‘Our Dark Hands and Sore Backs’: The Comité Cívico Popular Mixteco and the New Grassroots Activism by Indigenous Mexican Migrants,” </w:t>
+        <w:t xml:space="preserve">Jorge Ramirez-Lopez, “‘Our Dark Hands and Sore Backs’: The Comité Cívico Popular Mixteco and the New Grassroots Activism by Indigenous Mexican Migrants,” </w:t>
       </w:r>
       <w:r>
         <w:rPr>
@@ -9226,7 +9317,7 @@
       </w:r>
       <w:r>
         <w:rPr/>
-        <w:t xml:space="preserve"> 43, no.2 (2024): 5–33</w:t>
+        <w:t xml:space="preserve"> 43, no. 2 (2024): 5–33</w:t>
       </w:r>
     </w:p>
     <w:p>
@@ -9310,7 +9401,7 @@
       </w:hyperlink>
       <w:r>
         <w:rPr/>
-        <w:t xml:space="preserve"> PBS (documentary)</w:t>
+        <w:t xml:space="preserve">, PBS (documentary)</w:t>
       </w:r>
     </w:p>
     <w:p>
@@ -9349,7 +9440,7 @@
       </w:pPr>
       <w:r>
         <w:rPr/>
-        <w:t xml:space="preserve">Lib Tietjen and Kira Garcia, </w:t>
+        <w:t xml:space="preserve">Lib Tietjen and Kira Garcia, "</w:t>
       </w:r>
       <w:hyperlink w:history="1" r:id="rId143">
         <w:r>
@@ -9362,7 +9453,7 @@
       </w:hyperlink>
       <w:r>
         <w:rPr/>
-        <w:t xml:space="preserve">, Tenement Museum, November 26, 2013 (public-facing article)</w:t>
+        <w:t xml:space="preserve">", Tenement Museum, November 26, 2013 (public-facing article)</w:t>
       </w:r>
     </w:p>
     <w:p>
@@ -9700,6 +9791,14 @@
         <w:rPr/>
         <w:t xml:space="preserve">, Mapping American Social Movements Project (digital mapping project)</w:t>
       </w:r>
+    </w:p>
+    <w:p>
+      <w:pPr>
+        <w:pBdr>
+          <w:bottom w:val="single" w:sz="6" w:space="1" w:color="auto"/>
+        </w:pBdr>
+        <w:spacing w:before="0" w:after="0" w:line="1" w:lineRule="auto"/>
+      </w:pPr>
     </w:p>
     <w:p>
       <w:pPr>
@@ -9715,7 +9814,7 @@
       <w:pPr/>
       <w:r>
         <w:rPr/>
-        <w:t xml:space="preserve">United States expansion resulted in shifting and in many ways permeable national borders for generations. As the US increased its efforts to exclude and expel “undesirable” immigrants,border policing took on increased importance. From the creation of the Border Patrol in 1924 to “prevention through deterrence” in the early 1990s and into the 21st century, the US has expanded its efforts to regulate human mobility across national borders. In popular discourse, “the border” has long been shorthand for the Southwest, a product of an imaginary that linked Mexicanness with illegality and the region most linked to their presence as a place in need of policing. But in fact “the border” has historically encompassed all of the nation’s land and water boundaries, as well as other physical spaces that served as entry points into sovereign territory, such as airports. To maintain spatial control the US instituted uneven enforcement strategies at its myriad ports of entry and created legal regimes that codified border crossings as criminally transgressive. Border enforcement has created humanitarian catastrophes as landscapes have been weaponized as tools of exclusion. But borderlands are not solely spaces of state violence and control; they are also vibrant transnational spaces of community and culture.</w:t>
+        <w:t xml:space="preserve">US expansion resulted in shifting and in many ways permeable national borders for generations. As the United States increased its efforts to exclude and expel “undesirable” immigrants, border policing took on increased importance. From the creation of the Border Patrol in 1924 to “prevention through deterrence” in the early 1990s and into the twenty-first century, the United States has expanded its efforts to regulate human mobility across national borders. In popular discourse, “the border” has long been shorthand for the Southwest, a product of an imaginary that linked Mexicanness with illegality and the region most linked to their presence as a place in need of policing. But in fact “the border” has historically encompassed all of the nation’s land and water boundaries, as well as other physical spaces that served as entry points into sovereign territory, such as airports. To maintain spatial control, the United States instituted uneven enforcement strategies at its myriad ports of entry and created legal regimes that codified border crossings as criminally transgressive. Border enforcement has created humanitarian catastrophes as landscapes have been weaponized as tools of exclusion. But borderlands are not solely spaces of state violence and control; they are also vibrant transnational spaces of community and culture.</w:t>
       </w:r>
     </w:p>
     <w:p>
@@ -9771,7 +9870,7 @@
         <w:rPr>
           <w:i/>
         </w:rPr>
-        <w:t xml:space="preserve">Borders of Violence &amp; Justice: Mexicans, Mexican Americans, and Law Enforcement in the Southwest, 1835-1935</w:t>
+        <w:t xml:space="preserve">Borders of Violence &amp; Justice: Mexicans, Mexican Americans, and Law Enforcement in the Southwest, 1835–1935</w:t>
       </w:r>
       <w:r>
         <w:rPr/>
@@ -10078,7 +10177,7 @@
             <w:color w:val="0000FF" w:themeColor="hyperlink"/>
             <w:u w:val="single"/>
           </w:rPr>
-          <w:t xml:space="preserve">Report of the Boundary Commission upon the Survey and Re-marking of the Boundary between the United States and Mexico West of the Rio Grande, 1891-96</w:t>
+          <w:t xml:space="preserve">Report of the Boundary Commission upon the Survey and Re-Marking of the Boundary Between the United States and Mexico West of the Rio Grande, 1891-96</w:t>
         </w:r>
       </w:hyperlink>
       <w:r>
@@ -10208,7 +10307,7 @@
       </w:hyperlink>
       <w:r>
         <w:rPr/>
-        <w:t xml:space="preserve"> (documentary)</w:t>
+        <w:t xml:space="preserve">, PBS (documentary)</w:t>
       </w:r>
     </w:p>
     <w:p>
@@ -10307,23 +10406,27 @@
           <w:numId w:val="26"/>
         </w:numPr>
       </w:pPr>
-      <w:r>
-        <w:rPr/>
-        <w:t xml:space="preserve">“</w:t>
-      </w:r>
       <w:hyperlink w:history="1" r:id="rId166">
         <w:r>
           <w:rPr>
             <w:color w:val="0000FF" w:themeColor="hyperlink"/>
             <w:u w:val="single"/>
           </w:rPr>
-          <w:t xml:space="preserve">‘No Olvidado’: These Americans Find and Bury Missing Migrants</w:t>
-        </w:r>
-      </w:hyperlink>
-      <w:r>
-        <w:rPr/>
-        <w:t xml:space="preserve">,” CNN (documentary)</w:t>
-      </w:r>
+          <w:t xml:space="preserve">No Olvidado: These Americans Find and Bury Missing Migrants</w:t>
+        </w:r>
+      </w:hyperlink>
+      <w:r>
+        <w:rPr/>
+        <w:t xml:space="preserve">, CNN (documentary)</w:t>
+      </w:r>
+    </w:p>
+    <w:p>
+      <w:pPr>
+        <w:pBdr>
+          <w:bottom w:val="single" w:sz="6" w:space="1" w:color="auto"/>
+        </w:pBdr>
+        <w:spacing w:before="0" w:after="0" w:line="1" w:lineRule="auto"/>
+      </w:pPr>
     </w:p>
     <w:p>
       <w:pPr>
@@ -10339,7 +10442,7 @@
       <w:pPr/>
       <w:r>
         <w:rPr/>
-        <w:t xml:space="preserve">US efforts to exclude and expel undesirable immigrants resulted in the creation of massive systems of detention and deportation. Deportation has its roots in colonial-era practices of “warning out.” Precedents for deportation are also evident in antebellum schemes to remove emancipated slaves to a colony in Africa and the federal government’s forcible return of fugitives to their enslavers. Before the Civil War, state governments expelled “undesirable” foreigners, such as the Irish poor. Deportation expanded after the introduction of federal Chinese exclusion in the late 19th century, as US law concretized the sovereign right to expel unauthorized immigrants and concluded that such expulsion was an administrative matter rather than punishment for a crime. Immigrant detention began as an administrative matter as well: a temporary holding while deportations were processed or while an immigrant’s admissibility was determined. As with deportation, the inherently punitive nature of incarceration was minimized and obscured from the earliest days of this practice. Beginning in the 1980s, detention was radically expanded to deter migrants and asylum seekers, making immigrant incarceration a fundamental element of the US’s vast carceral system.</w:t>
+        <w:t xml:space="preserve">US efforts to exclude and expel undesirable immigrants resulted in the creation of massive systems of detention and deportation. Deportation has its roots in colonial-era practices of “warning out.” Precedents for deportation are also evident in antebellum schemes to remove emancipated slaves to a colony in Africa and the federal government’s forcible return of fugitives to their enslavers. Before the Civil War, state governments expelled “undesirable” foreigners, such as the Irish poor. Deportation expanded after the introduction of federal Chinese exclusion in the late nineteenth century, as US law concretized the sovereign right to expel unauthorized immigrants and concluded that such expulsion was an administrative matter rather than punishment for a crime. Immigrant detention began as an administrative matter as well: a temporary holding while deportations were processed or while an immigrant’s admissibility was determined. As with deportation, the inherently punitive nature of incarceration was minimized and obscured from the earliest days of this practice. Beginning in the 1980s, detention was radically expanded to deter migrants and asylum seekers, making immigrant incarceration a fundamental element of the United States' vast carceral system.</w:t>
       </w:r>
     </w:p>
     <w:p>
@@ -10639,7 +10742,7 @@
       </w:pPr>
       <w:r>
         <w:rPr/>
-        <w:t xml:space="preserve">Eithne Luibhéid and Karma R. Chávez, </w:t>
+        <w:t xml:space="preserve">Eithne Luibhéid and Karma R. Chávez, eds., </w:t>
       </w:r>
       <w:r>
         <w:rPr>
@@ -10664,7 +10767,7 @@
       </w:pPr>
       <w:r>
         <w:rPr/>
-        <w:t xml:space="preserve">Kelly Lytle Hernández, “The Crimes and Consequences of Illegal Immigration: A Cross-Border Examination of Operation Wetback, 1943-1954,” </w:t>
+        <w:t xml:space="preserve">Kelly Lytle Hernández, “The Crimes and Consequences of Illegal Immigration: A Cross-Border Examination of Operation Wetback, 1943–1954,” </w:t>
       </w:r>
       <w:r>
         <w:rPr>
@@ -10674,7 +10777,7 @@
       </w:r>
       <w:r>
         <w:rPr/>
-        <w:t xml:space="preserve"> (Winter 2006), 421-444</w:t>
+        <w:t xml:space="preserve"> (Winter 2006), 421–444</w:t>
       </w:r>
     </w:p>
     <w:p>
@@ -10832,7 +10935,7 @@
       </w:hyperlink>
       <w:r>
         <w:rPr/>
-        <w:t xml:space="preserve">, University of Arizona Library (online exhibition)</w:t>
+        <w:t xml:space="preserve">, University of Arizona Libraries (online exhibition)</w:t>
       </w:r>
     </w:p>
     <w:p>
@@ -10899,12 +11002,12 @@
             <w:color w:val="0000FF" w:themeColor="hyperlink"/>
             <w:u w:val="single"/>
           </w:rPr>
-          <w:t xml:space="preserve">Emma Goldman on the restriction of civil liberties</w:t>
-        </w:r>
-      </w:hyperlink>
-      <w:r>
-        <w:rPr/>
-        <w:t xml:space="preserve">, 1919, The Gilder Lehrman Institute of American History (primary source)</w:t>
+          <w:t xml:space="preserve">Emma Goldman on the restriction of civil liberties, 1919</w:t>
+        </w:r>
+      </w:hyperlink>
+      <w:r>
+        <w:rPr/>
+        <w:t xml:space="preserve">, Gilder Lehrman Institute of American History (primary source)</w:t>
       </w:r>
     </w:p>
     <w:p>
@@ -10943,7 +11046,7 @@
       </w:pPr>
       <w:r>
         <w:rPr/>
-        <w:t xml:space="preserve">Alex Wagner, </w:t>
+        <w:t xml:space="preserve">Alex Wagner, “</w:t>
       </w:r>
       <w:hyperlink w:history="1" r:id="rId173">
         <w:r>
@@ -10951,12 +11054,12 @@
             <w:color w:val="0000FF" w:themeColor="hyperlink"/>
             <w:u w:val="single"/>
           </w:rPr>
-          <w:t xml:space="preserve">“America’s Forgotten History of Illegal Deportations,”</w:t>
-        </w:r>
-      </w:hyperlink>
-      <w:r>
-        <w:rPr/>
-        <w:t xml:space="preserve"> </w:t>
+          <w:t xml:space="preserve">America’s Forgotten History of Illegal Deportations</w:t>
+        </w:r>
+      </w:hyperlink>
+      <w:r>
+        <w:rPr/>
+        <w:t xml:space="preserve">,” </w:t>
       </w:r>
       <w:r>
         <w:rPr>
@@ -11056,7 +11159,7 @@
       </w:hyperlink>
       <w:r>
         <w:rPr/>
-        <w:t xml:space="preserve"> (digital exhibit)</w:t>
+        <w:t xml:space="preserve">, Carceral State Project (digital exhibit)</w:t>
       </w:r>
     </w:p>
     <w:p>
@@ -11082,6 +11185,14 @@
         <w:rPr/>
         <w:t xml:space="preserve">, Netflix (documentary series)</w:t>
       </w:r>
+    </w:p>
+    <w:p>
+      <w:pPr>
+        <w:pBdr>
+          <w:bottom w:val="single" w:sz="6" w:space="1" w:color="auto"/>
+        </w:pBdr>
+        <w:spacing w:before="0" w:after="0" w:line="1" w:lineRule="auto"/>
+      </w:pPr>
     </w:p>
     <w:p>
       <w:pPr>
@@ -11090,14 +11201,14 @@
       </w:pPr>
       <w:r>
         <w:rPr/>
-        <w:t xml:space="preserve">Week 15: The 21st Century</w:t>
+        <w:t xml:space="preserve">Week 15: The Twenty-First Century</w:t>
       </w:r>
     </w:p>
     <w:p>
       <w:pPr/>
       <w:r>
         <w:rPr/>
-        <w:t xml:space="preserve">The United States experienced a resurgence of nativism at the turn of the 21st century. In the 1990s, states and the federal government passed laws restricting the rights and mobility of immigrants. The surveillance and criminalization of immigrants increased again after the attacks of September 11, 2001, when the United States reorganized its immigration bureaucracy as part of its “global war on terrorism,” efforts frequently marked by Islamophobia and racism. Stalled efforts to pass immigration reform legislation combined with ongoing global migrations related to climate change, war, and conflict made immigration an increasingly salient and politicized issue in the United States. While the 21st century has seen powerful immigrant rights organizing and daily reminders of the strength of immigrant communities, xenophobia and immigrant scapegoating pervade political discourse, and immigrant communities are under threat. (Due to the timing of this update, the proliferation of analysis and documents reflecting the second Trump administration could not be included here.)</w:t>
+        <w:t xml:space="preserve">The United States experienced a resurgence of nativism at the turn of the twenty-first century. In the 1990s, states and the federal government passed laws restricting the rights and mobility of immigrants. The surveillance and criminalization of immigrants increased again after the attacks of September 11, 2001, when the United States reorganized its immigration bureaucracy as part of its “global war on terrorism,” efforts frequently marked by Islamophobia and racism. Stalled efforts to pass immigration reform legislation combined with ongoing global migrations related to climate change, war, and conflict made immigration an increasingly salient and politicized issue in the United States. While the twenty-first century has seen powerful immigrant rights organizing and daily reminders of the strength of immigrant communities, xenophobia and immigrant scapegoating pervade political discourse, and immigrant communities are under threat. (Due to the timing of this update, the proliferation of analysis and documents reflecting the second Trump administration could not be included here.)</w:t>
       </w:r>
     </w:p>
     <w:p>
@@ -11247,7 +11358,7 @@
       </w:pPr>
       <w:r>
         <w:rPr/>
-        <w:t xml:space="preserve">Phillip B. Gonzales, Renato Rosaldo, and Mary Louise Pratt, </w:t>
+        <w:t xml:space="preserve">Phillip B. Gonzales, Renato Rosaldo, and Mary Louise Pratt, eds., </w:t>
       </w:r>
       <w:r>
         <w:rPr>
@@ -11480,7 +11591,7 @@
       </w:r>
       <w:r>
         <w:rPr/>
-        <w:t xml:space="preserve">, September 7, 2010</w:t>
+        <w:t xml:space="preserve">, September 7, 2010 (public facing article)</w:t>
       </w:r>
     </w:p>
     <w:p>
@@ -11603,7 +11714,7 @@
             <w:color w:val="0000FF" w:themeColor="hyperlink"/>
             <w:u w:val="single"/>
           </w:rPr>
-          <w:t xml:space="preserve">How Grandma Got Legal</w:t>
+          <w:t xml:space="preserve">How grandma got legal</w:t>
         </w:r>
       </w:hyperlink>
       <w:r>
@@ -11626,7 +11737,7 @@
             <w:color w:val="0000FF" w:themeColor="hyperlink"/>
             <w:u w:val="single"/>
           </w:rPr>
-          <w:t xml:space="preserve">Second-Class Citizens</w:t>
+          <w:t xml:space="preserve">Second-Class Noncitizens</w:t>
         </w:r>
       </w:hyperlink>
       <w:r>
@@ -11708,7 +11819,7 @@
             <w:color w:val="0000FF" w:themeColor="hyperlink"/>
             <w:u w:val="single"/>
           </w:rPr>
-          <w:t xml:space="preserve">Out of Status</w:t>
+          <w:t xml:space="preserve">Out of State</w:t>
         </w:r>
       </w:hyperlink>
       <w:r>
@@ -11780,7 +11891,7 @@
       </w:pPr>
       <w:r>
         <w:rPr/>
-        <w:t xml:space="preserve">Caitlin Dickerson, </w:t>
+        <w:t xml:space="preserve">Caitlin Dickerson, “</w:t>
       </w:r>
       <w:hyperlink w:history="1" r:id="rId190">
         <w:r>
@@ -11788,12 +11899,12 @@
             <w:color w:val="0000FF" w:themeColor="hyperlink"/>
             <w:u w:val="single"/>
           </w:rPr>
-          <w:t xml:space="preserve">“The Secret History of Family Separation,”</w:t>
-        </w:r>
-      </w:hyperlink>
-      <w:r>
-        <w:rPr/>
-        <w:t xml:space="preserve"> </w:t>
+          <w:t xml:space="preserve">The secret history of the U.S. government's family-separation policy</w:t>
+        </w:r>
+      </w:hyperlink>
+      <w:r>
+        <w:rPr/>
+        <w:t xml:space="preserve">,” </w:t>
       </w:r>
       <w:r>
         <w:rPr>
@@ -11826,7 +11937,7 @@
             <w:color w:val="0000FF" w:themeColor="hyperlink"/>
             <w:u w:val="single"/>
           </w:rPr>
-          <w:t xml:space="preserve">Donald Trump’s Ban on Muslims Echoes Earliest Days of Nazi Propaganda</w:t>
+          <w:t xml:space="preserve">Donald Trump’s ban on Muslims echoes earliest days of Nazi propaganda</w:t>
         </w:r>
       </w:hyperlink>
       <w:r>
@@ -11864,7 +11975,7 @@
             <w:color w:val="0000FF" w:themeColor="hyperlink"/>
             <w:u w:val="single"/>
           </w:rPr>
-          <w:t xml:space="preserve">A History Lesson for Donald Trump</w:t>
+          <w:t xml:space="preserve">A history lesson for Donald Trump and his supporters</w:t>
         </w:r>
       </w:hyperlink>
       <w:r>

</xml_diff>